<commit_message>
FRS v1.2: add CV Upload (FR-001) & Search/Filter (FR-003) field specs; wire up wireframe links
- Section V: replace empty Figma placeholder with live Canva wireframe link
  + named Figma prototype placeholder (Coming soon, Dec 2026)
- Add field-level spec table for FR-001 (CV Upload form fields)
- Add field-level spec table for FR-003 (Search/Filter fields)
- Renumber Error Codes heading 3 -> 5

Co-Authored-By: Claude Opus 4.8 <noreply@anthropic.com>
</commit_message>
<xml_diff>
--- a/docs/geng-ats/GenG_FRS_v1.2.docx
+++ b/docs/geng-ats/GenG_FRS_v1.2.docx
@@ -3769,9 +3769,1095 @@
       </w:pPr>
       <w:r>
         <w:rPr>
+          <w:b w:val="0"/>
+        </w:rPr>
+        <w:t>3. Đặc tả trường dữ liệu — Chức năng Tải lên hồ sơ ứng viên / CV Upload (FR-001)</w:t>
+      </w:r>
+    </w:p>
+    <w:p>
+      <w:pPr/>
+      <w:r>
+        <w:rPr>
+          <w:b w:val="0"/>
+        </w:rPr>
+        <w:t>Các trường của biểu mẫu tải lên hồ sơ (form CV Upload):</w:t>
+      </w:r>
+    </w:p>
+    <w:tbl>
+      <w:tblPr>
+        <w:tblStyle w:val="TableGrid"/>
+        <w:tblW w:type="auto" w:w="0"/>
+        <w:tblLook w:firstColumn="1" w:firstRow="1" w:lastColumn="0" w:lastRow="0" w:noHBand="0" w:noVBand="1" w:val="04A0"/>
+      </w:tblPr>
+      <w:tblGrid>
+        <w:gridCol w:w="1377"/>
+        <w:gridCol w:w="1377"/>
+        <w:gridCol w:w="1377"/>
+        <w:gridCol w:w="1377"/>
+        <w:gridCol w:w="1377"/>
+        <w:gridCol w:w="1377"/>
+        <w:gridCol w:w="1377"/>
+      </w:tblGrid>
+      <w:tr>
+        <w:tc>
+          <w:tcPr>
+            <w:tcW w:type="dxa" w:w="1377"/>
+          </w:tcPr>
+          <w:p>
+            <w:r/>
+            <w:r>
+              <w:rPr>
+                <w:b/>
+                <w:sz w:val="18"/>
+              </w:rPr>
+              <w:t>ID</w:t>
+            </w:r>
+          </w:p>
+        </w:tc>
+        <w:tc>
+          <w:tcPr>
+            <w:tcW w:type="dxa" w:w="1377"/>
+          </w:tcPr>
+          <w:p>
+            <w:r/>
+            <w:r>
+              <w:rPr>
+                <w:b/>
+                <w:sz w:val="18"/>
+              </w:rPr>
+              <w:t>Trường</w:t>
+            </w:r>
+          </w:p>
+        </w:tc>
+        <w:tc>
+          <w:tcPr>
+            <w:tcW w:type="dxa" w:w="1377"/>
+          </w:tcPr>
+          <w:p>
+            <w:r/>
+            <w:r>
+              <w:rPr>
+                <w:b/>
+                <w:sz w:val="18"/>
+              </w:rPr>
+              <w:t>Kiểu trường</w:t>
+            </w:r>
+          </w:p>
+        </w:tc>
+        <w:tc>
+          <w:tcPr>
+            <w:tcW w:type="dxa" w:w="1377"/>
+          </w:tcPr>
+          <w:p>
+            <w:r/>
+            <w:r>
+              <w:rPr>
+                <w:b/>
+                <w:sz w:val="18"/>
+              </w:rPr>
+              <w:t>Bắt buộc</w:t>
+            </w:r>
+          </w:p>
+        </w:tc>
+        <w:tc>
+          <w:tcPr>
+            <w:tcW w:type="dxa" w:w="1377"/>
+          </w:tcPr>
+          <w:p>
+            <w:r/>
+            <w:r>
+              <w:rPr>
+                <w:b/>
+                <w:sz w:val="18"/>
+              </w:rPr>
+              <w:t>Sửa được</w:t>
+            </w:r>
+          </w:p>
+        </w:tc>
+        <w:tc>
+          <w:tcPr>
+            <w:tcW w:type="dxa" w:w="1377"/>
+          </w:tcPr>
+          <w:p>
+            <w:r/>
+            <w:r>
+              <w:rPr>
+                <w:b/>
+                <w:sz w:val="18"/>
+              </w:rPr>
+              <w:t>Kiểu dữ liệu</w:t>
+            </w:r>
+          </w:p>
+        </w:tc>
+        <w:tc>
+          <w:tcPr>
+            <w:tcW w:type="dxa" w:w="1377"/>
+          </w:tcPr>
+          <w:p>
+            <w:r/>
+            <w:r>
+              <w:rPr>
+                <w:b/>
+                <w:sz w:val="18"/>
+              </w:rPr>
+              <w:t>Mô tả</w:t>
+            </w:r>
+          </w:p>
+        </w:tc>
+      </w:tr>
+      <w:tr>
+        <w:tc>
+          <w:tcPr>
+            <w:tcW w:type="dxa" w:w="1377"/>
+          </w:tcPr>
+          <w:p>
+            <w:r/>
+            <w:r>
+              <w:rPr>
+                <w:sz w:val="18"/>
+              </w:rPr>
+              <w:t>01US-00</w:t>
+            </w:r>
+          </w:p>
+        </w:tc>
+        <w:tc>
+          <w:tcPr>
+            <w:tcW w:type="dxa" w:w="1377"/>
+          </w:tcPr>
+          <w:p>
+            <w:r/>
+            <w:r>
+              <w:rPr>
+                <w:sz w:val="18"/>
+              </w:rPr>
+              <w:t>Tệp CV (CV File)</w:t>
+            </w:r>
+          </w:p>
+        </w:tc>
+        <w:tc>
+          <w:tcPr>
+            <w:tcW w:type="dxa" w:w="1377"/>
+          </w:tcPr>
+          <w:p>
+            <w:r/>
+            <w:r>
+              <w:rPr>
+                <w:sz w:val="18"/>
+              </w:rPr>
+              <w:t>FILE UPLOAD</w:t>
+            </w:r>
+          </w:p>
+        </w:tc>
+        <w:tc>
+          <w:tcPr>
+            <w:tcW w:type="dxa" w:w="1377"/>
+          </w:tcPr>
+          <w:p>
+            <w:r/>
+            <w:r>
+              <w:rPr>
+                <w:sz w:val="18"/>
+              </w:rPr>
+              <w:t>Có</w:t>
+            </w:r>
+          </w:p>
+        </w:tc>
+        <w:tc>
+          <w:tcPr>
+            <w:tcW w:type="dxa" w:w="1377"/>
+          </w:tcPr>
+          <w:p>
+            <w:r/>
+            <w:r>
+              <w:rPr>
+                <w:sz w:val="18"/>
+              </w:rPr>
+              <w:t>—</w:t>
+            </w:r>
+          </w:p>
+        </w:tc>
+        <w:tc>
+          <w:tcPr>
+            <w:tcW w:type="dxa" w:w="1377"/>
+          </w:tcPr>
+          <w:p>
+            <w:r/>
+            <w:r>
+              <w:rPr>
+                <w:sz w:val="18"/>
+              </w:rPr>
+              <w:t>FILE</w:t>
+            </w:r>
+          </w:p>
+        </w:tc>
+        <w:tc>
+          <w:tcPr>
+            <w:tcW w:type="dxa" w:w="1377"/>
+          </w:tcPr>
+          <w:p>
+            <w:r/>
+            <w:r>
+              <w:rPr>
+                <w:sz w:val="18"/>
+              </w:rPr>
+              <w:t>Định dạng .pdf/.doc/.docx (AC1.1; sai định dạng → ER03); dung lượng ≤ ngưỡng cho phép (ER05)</w:t>
+            </w:r>
+          </w:p>
+        </w:tc>
+      </w:tr>
+      <w:tr>
+        <w:tc>
+          <w:tcPr>
+            <w:tcW w:type="dxa" w:w="1377"/>
+          </w:tcPr>
+          <w:p>
+            <w:r/>
+            <w:r>
+              <w:rPr>
+                <w:sz w:val="18"/>
+              </w:rPr>
+              <w:t>01US-01</w:t>
+            </w:r>
+          </w:p>
+        </w:tc>
+        <w:tc>
+          <w:tcPr>
+            <w:tcW w:type="dxa" w:w="1377"/>
+          </w:tcPr>
+          <w:p>
+            <w:r/>
+            <w:r>
+              <w:rPr>
+                <w:sz w:val="18"/>
+              </w:rPr>
+              <w:t>Vị trí ứng tuyển (Vacancy)</w:t>
+            </w:r>
+          </w:p>
+        </w:tc>
+        <w:tc>
+          <w:tcPr>
+            <w:tcW w:type="dxa" w:w="1377"/>
+          </w:tcPr>
+          <w:p>
+            <w:r/>
+            <w:r>
+              <w:rPr>
+                <w:sz w:val="18"/>
+              </w:rPr>
+              <w:t>SELECT</w:t>
+            </w:r>
+          </w:p>
+        </w:tc>
+        <w:tc>
+          <w:tcPr>
+            <w:tcW w:type="dxa" w:w="1377"/>
+          </w:tcPr>
+          <w:p>
+            <w:r/>
+            <w:r>
+              <w:rPr>
+                <w:sz w:val="18"/>
+              </w:rPr>
+              <w:t>Có</w:t>
+            </w:r>
+          </w:p>
+        </w:tc>
+        <w:tc>
+          <w:tcPr>
+            <w:tcW w:type="dxa" w:w="1377"/>
+          </w:tcPr>
+          <w:p>
+            <w:r/>
+            <w:r>
+              <w:rPr>
+                <w:sz w:val="18"/>
+              </w:rPr>
+              <w:t>Có</w:t>
+            </w:r>
+          </w:p>
+        </w:tc>
+        <w:tc>
+          <w:tcPr>
+            <w:tcW w:type="dxa" w:w="1377"/>
+          </w:tcPr>
+          <w:p>
+            <w:r/>
+            <w:r>
+              <w:rPr>
+                <w:sz w:val="18"/>
+              </w:rPr>
+              <w:t>VARCHAR</w:t>
+            </w:r>
+          </w:p>
+        </w:tc>
+        <w:tc>
+          <w:tcPr>
+            <w:tcW w:type="dxa" w:w="1377"/>
+          </w:tcPr>
+          <w:p>
+            <w:r/>
+            <w:r>
+              <w:rPr>
+                <w:sz w:val="18"/>
+              </w:rPr>
+              <w:t>[[XÁC NHẬN]] gắn vị trí cho hồ sơ khi tải lên (liên kết FR-006)</w:t>
+            </w:r>
+          </w:p>
+        </w:tc>
+      </w:tr>
+      <w:tr>
+        <w:tc>
+          <w:tcPr>
+            <w:tcW w:type="dxa" w:w="1377"/>
+          </w:tcPr>
+          <w:p>
+            <w:r/>
+            <w:r>
+              <w:rPr>
+                <w:sz w:val="18"/>
+              </w:rPr>
+              <w:t>01US-02</w:t>
+            </w:r>
+          </w:p>
+        </w:tc>
+        <w:tc>
+          <w:tcPr>
+            <w:tcW w:type="dxa" w:w="1377"/>
+          </w:tcPr>
+          <w:p>
+            <w:r/>
+            <w:r>
+              <w:rPr>
+                <w:sz w:val="18"/>
+              </w:rPr>
+              <w:t>Tải lên hàng loạt (Bulk)</w:t>
+            </w:r>
+          </w:p>
+        </w:tc>
+        <w:tc>
+          <w:tcPr>
+            <w:tcW w:type="dxa" w:w="1377"/>
+          </w:tcPr>
+          <w:p>
+            <w:r/>
+            <w:r>
+              <w:rPr>
+                <w:sz w:val="18"/>
+              </w:rPr>
+              <w:t>CHECKBOX</w:t>
+            </w:r>
+          </w:p>
+        </w:tc>
+        <w:tc>
+          <w:tcPr>
+            <w:tcW w:type="dxa" w:w="1377"/>
+          </w:tcPr>
+          <w:p>
+            <w:r/>
+            <w:r>
+              <w:rPr>
+                <w:sz w:val="18"/>
+              </w:rPr>
+              <w:t>Không</w:t>
+            </w:r>
+          </w:p>
+        </w:tc>
+        <w:tc>
+          <w:tcPr>
+            <w:tcW w:type="dxa" w:w="1377"/>
+          </w:tcPr>
+          <w:p>
+            <w:r/>
+            <w:r>
+              <w:rPr>
+                <w:sz w:val="18"/>
+              </w:rPr>
+              <w:t>—</w:t>
+            </w:r>
+          </w:p>
+        </w:tc>
+        <w:tc>
+          <w:tcPr>
+            <w:tcW w:type="dxa" w:w="1377"/>
+          </w:tcPr>
+          <w:p>
+            <w:r/>
+            <w:r>
+              <w:rPr>
+                <w:sz w:val="18"/>
+              </w:rPr>
+              <w:t>BOOLEAN</w:t>
+            </w:r>
+          </w:p>
+        </w:tc>
+        <w:tc>
+          <w:tcPr>
+            <w:tcW w:type="dxa" w:w="1377"/>
+          </w:tcPr>
+          <w:p>
+            <w:r/>
+            <w:r>
+              <w:rPr>
+                <w:sz w:val="18"/>
+              </w:rPr>
+              <w:t>[[CHỐT YÊU CẦU — TC-UP-005]]: bật để nạp nhiều tệp vào hàng đợi xử lý</w:t>
+            </w:r>
+          </w:p>
+        </w:tc>
+      </w:tr>
+      <w:tr>
+        <w:tc>
+          <w:tcPr>
+            <w:tcW w:type="dxa" w:w="1377"/>
+          </w:tcPr>
+          <w:p>
+            <w:r/>
+            <w:r>
+              <w:rPr>
+                <w:sz w:val="18"/>
+              </w:rPr>
+              <w:t>01US-03</w:t>
+            </w:r>
+          </w:p>
+        </w:tc>
+        <w:tc>
+          <w:tcPr>
+            <w:tcW w:type="dxa" w:w="1377"/>
+          </w:tcPr>
+          <w:p>
+            <w:r/>
+            <w:r>
+              <w:rPr>
+                <w:sz w:val="18"/>
+              </w:rPr>
+              <w:t>Trạng thái khởi tạo</w:t>
+            </w:r>
+          </w:p>
+        </w:tc>
+        <w:tc>
+          <w:tcPr>
+            <w:tcW w:type="dxa" w:w="1377"/>
+          </w:tcPr>
+          <w:p>
+            <w:r/>
+            <w:r>
+              <w:rPr>
+                <w:sz w:val="18"/>
+              </w:rPr>
+              <w:t>SYSTEM (auto)</w:t>
+            </w:r>
+          </w:p>
+        </w:tc>
+        <w:tc>
+          <w:tcPr>
+            <w:tcW w:type="dxa" w:w="1377"/>
+          </w:tcPr>
+          <w:p>
+            <w:r/>
+            <w:r>
+              <w:rPr>
+                <w:sz w:val="18"/>
+              </w:rPr>
+              <w:t>Có</w:t>
+            </w:r>
+          </w:p>
+        </w:tc>
+        <w:tc>
+          <w:tcPr>
+            <w:tcW w:type="dxa" w:w="1377"/>
+          </w:tcPr>
+          <w:p>
+            <w:r/>
+            <w:r>
+              <w:rPr>
+                <w:sz w:val="18"/>
+              </w:rPr>
+              <w:t>Không</w:t>
+            </w:r>
+          </w:p>
+        </w:tc>
+        <w:tc>
+          <w:tcPr>
+            <w:tcW w:type="dxa" w:w="1377"/>
+          </w:tcPr>
+          <w:p>
+            <w:r/>
+            <w:r>
+              <w:rPr>
+                <w:sz w:val="18"/>
+              </w:rPr>
+              <w:t>ENUM('New')</w:t>
+            </w:r>
+          </w:p>
+        </w:tc>
+        <w:tc>
+          <w:tcPr>
+            <w:tcW w:type="dxa" w:w="1377"/>
+          </w:tcPr>
+          <w:p>
+            <w:r/>
+            <w:r>
+              <w:rPr>
+                <w:sz w:val="18"/>
+              </w:rPr>
+              <w:t>Gán mặc định 'New' sau khi tải lên thành công (AC1.4)</w:t>
+            </w:r>
+          </w:p>
+        </w:tc>
+      </w:tr>
+    </w:tbl>
+    <w:p>
+      <w:pPr>
+        <w:pStyle w:val="Heading2"/>
+      </w:pPr>
+      <w:r>
+        <w:rPr>
+          <w:b w:val="0"/>
+        </w:rPr>
+        <w:t>4. Đặc tả trường dữ liệu — Chức năng Tìm kiếm/Lọc ứng viên theo từ khoá (FR-003)</w:t>
+      </w:r>
+    </w:p>
+    <w:p>
+      <w:pPr/>
+      <w:r>
+        <w:rPr>
+          <w:b w:val="0"/>
+        </w:rPr>
+        <w:t>Các trường của giao diện tìm kiếm &amp; lọc ứng viên:</w:t>
+      </w:r>
+    </w:p>
+    <w:tbl>
+      <w:tblPr>
+        <w:tblStyle w:val="TableGrid"/>
+        <w:tblW w:type="auto" w:w="0"/>
+        <w:tblLook w:firstColumn="1" w:firstRow="1" w:lastColumn="0" w:lastRow="0" w:noHBand="0" w:noVBand="1" w:val="04A0"/>
+      </w:tblPr>
+      <w:tblGrid>
+        <w:gridCol w:w="1377"/>
+        <w:gridCol w:w="1377"/>
+        <w:gridCol w:w="1377"/>
+        <w:gridCol w:w="1377"/>
+        <w:gridCol w:w="1377"/>
+        <w:gridCol w:w="1377"/>
+        <w:gridCol w:w="1377"/>
+      </w:tblGrid>
+      <w:tr>
+        <w:tc>
+          <w:tcPr>
+            <w:tcW w:type="dxa" w:w="1377"/>
+          </w:tcPr>
+          <w:p>
+            <w:r/>
+            <w:r>
+              <w:rPr>
+                <w:b/>
+                <w:sz w:val="18"/>
+              </w:rPr>
+              <w:t>ID</w:t>
+            </w:r>
+          </w:p>
+        </w:tc>
+        <w:tc>
+          <w:tcPr>
+            <w:tcW w:type="dxa" w:w="1377"/>
+          </w:tcPr>
+          <w:p>
+            <w:r/>
+            <w:r>
+              <w:rPr>
+                <w:b/>
+                <w:sz w:val="18"/>
+              </w:rPr>
+              <w:t>Trường</w:t>
+            </w:r>
+          </w:p>
+        </w:tc>
+        <w:tc>
+          <w:tcPr>
+            <w:tcW w:type="dxa" w:w="1377"/>
+          </w:tcPr>
+          <w:p>
+            <w:r/>
+            <w:r>
+              <w:rPr>
+                <w:b/>
+                <w:sz w:val="18"/>
+              </w:rPr>
+              <w:t>Kiểu trường</w:t>
+            </w:r>
+          </w:p>
+        </w:tc>
+        <w:tc>
+          <w:tcPr>
+            <w:tcW w:type="dxa" w:w="1377"/>
+          </w:tcPr>
+          <w:p>
+            <w:r/>
+            <w:r>
+              <w:rPr>
+                <w:b/>
+                <w:sz w:val="18"/>
+              </w:rPr>
+              <w:t>Bắt buộc</w:t>
+            </w:r>
+          </w:p>
+        </w:tc>
+        <w:tc>
+          <w:tcPr>
+            <w:tcW w:type="dxa" w:w="1377"/>
+          </w:tcPr>
+          <w:p>
+            <w:r/>
+            <w:r>
+              <w:rPr>
+                <w:b/>
+                <w:sz w:val="18"/>
+              </w:rPr>
+              <w:t>Sửa được</w:t>
+            </w:r>
+          </w:p>
+        </w:tc>
+        <w:tc>
+          <w:tcPr>
+            <w:tcW w:type="dxa" w:w="1377"/>
+          </w:tcPr>
+          <w:p>
+            <w:r/>
+            <w:r>
+              <w:rPr>
+                <w:b/>
+                <w:sz w:val="18"/>
+              </w:rPr>
+              <w:t>Kiểu dữ liệu</w:t>
+            </w:r>
+          </w:p>
+        </w:tc>
+        <w:tc>
+          <w:tcPr>
+            <w:tcW w:type="dxa" w:w="1377"/>
+          </w:tcPr>
+          <w:p>
+            <w:r/>
+            <w:r>
+              <w:rPr>
+                <w:b/>
+                <w:sz w:val="18"/>
+              </w:rPr>
+              <w:t>Mô tả</w:t>
+            </w:r>
+          </w:p>
+        </w:tc>
+      </w:tr>
+      <w:tr>
+        <w:tc>
+          <w:tcPr>
+            <w:tcW w:type="dxa" w:w="1377"/>
+          </w:tcPr>
+          <w:p>
+            <w:r/>
+            <w:r>
+              <w:rPr>
+                <w:sz w:val="18"/>
+              </w:rPr>
+              <w:t>03US-00</w:t>
+            </w:r>
+          </w:p>
+        </w:tc>
+        <w:tc>
+          <w:tcPr>
+            <w:tcW w:type="dxa" w:w="1377"/>
+          </w:tcPr>
+          <w:p>
+            <w:r/>
+            <w:r>
+              <w:rPr>
+                <w:sz w:val="18"/>
+              </w:rPr>
+              <w:t>Từ khoá (Keyword)</w:t>
+            </w:r>
+          </w:p>
+        </w:tc>
+        <w:tc>
+          <w:tcPr>
+            <w:tcW w:type="dxa" w:w="1377"/>
+          </w:tcPr>
+          <w:p>
+            <w:r/>
+            <w:r>
+              <w:rPr>
+                <w:sz w:val="18"/>
+              </w:rPr>
+              <w:t>TEXT BOX</w:t>
+            </w:r>
+          </w:p>
+        </w:tc>
+        <w:tc>
+          <w:tcPr>
+            <w:tcW w:type="dxa" w:w="1377"/>
+          </w:tcPr>
+          <w:p>
+            <w:r/>
+            <w:r>
+              <w:rPr>
+                <w:sz w:val="18"/>
+              </w:rPr>
+              <w:t>Không</w:t>
+            </w:r>
+          </w:p>
+        </w:tc>
+        <w:tc>
+          <w:tcPr>
+            <w:tcW w:type="dxa" w:w="1377"/>
+          </w:tcPr>
+          <w:p>
+            <w:r/>
+            <w:r>
+              <w:rPr>
+                <w:sz w:val="18"/>
+              </w:rPr>
+              <w:t>Có</w:t>
+            </w:r>
+          </w:p>
+        </w:tc>
+        <w:tc>
+          <w:tcPr>
+            <w:tcW w:type="dxa" w:w="1377"/>
+          </w:tcPr>
+          <w:p>
+            <w:r/>
+            <w:r>
+              <w:rPr>
+                <w:sz w:val="18"/>
+              </w:rPr>
+              <w:t>VARCHAR</w:t>
+            </w:r>
+          </w:p>
+        </w:tc>
+        <w:tc>
+          <w:tcPr>
+            <w:tcW w:type="dxa" w:w="1377"/>
+          </w:tcPr>
+          <w:p>
+            <w:r/>
+            <w:r>
+              <w:rPr>
+                <w:sz w:val="18"/>
+              </w:rPr>
+              <w:t>Từ khoá kỹ năng/kinh nghiệm; không phân biệt hoa/thường (AC2.4)</w:t>
+            </w:r>
+          </w:p>
+        </w:tc>
+      </w:tr>
+      <w:tr>
+        <w:tc>
+          <w:tcPr>
+            <w:tcW w:type="dxa" w:w="1377"/>
+          </w:tcPr>
+          <w:p>
+            <w:r/>
+            <w:r>
+              <w:rPr>
+                <w:sz w:val="18"/>
+              </w:rPr>
+              <w:t>03US-01</w:t>
+            </w:r>
+          </w:p>
+        </w:tc>
+        <w:tc>
+          <w:tcPr>
+            <w:tcW w:type="dxa" w:w="1377"/>
+          </w:tcPr>
+          <w:p>
+            <w:r/>
+            <w:r>
+              <w:rPr>
+                <w:sz w:val="18"/>
+              </w:rPr>
+              <w:t>Trường lọc (Filter field)</w:t>
+            </w:r>
+          </w:p>
+        </w:tc>
+        <w:tc>
+          <w:tcPr>
+            <w:tcW w:type="dxa" w:w="1377"/>
+          </w:tcPr>
+          <w:p>
+            <w:r/>
+            <w:r>
+              <w:rPr>
+                <w:sz w:val="18"/>
+              </w:rPr>
+              <w:t>SELECT</w:t>
+            </w:r>
+          </w:p>
+        </w:tc>
+        <w:tc>
+          <w:tcPr>
+            <w:tcW w:type="dxa" w:w="1377"/>
+          </w:tcPr>
+          <w:p>
+            <w:r/>
+            <w:r>
+              <w:rPr>
+                <w:sz w:val="18"/>
+              </w:rPr>
+              <w:t>Không</w:t>
+            </w:r>
+          </w:p>
+        </w:tc>
+        <w:tc>
+          <w:tcPr>
+            <w:tcW w:type="dxa" w:w="1377"/>
+          </w:tcPr>
+          <w:p>
+            <w:r/>
+            <w:r>
+              <w:rPr>
+                <w:sz w:val="18"/>
+              </w:rPr>
+              <w:t>Có</w:t>
+            </w:r>
+          </w:p>
+        </w:tc>
+        <w:tc>
+          <w:tcPr>
+            <w:tcW w:type="dxa" w:w="1377"/>
+          </w:tcPr>
+          <w:p>
+            <w:r/>
+            <w:r>
+              <w:rPr>
+                <w:sz w:val="18"/>
+              </w:rPr>
+              <w:t>ENUM</w:t>
+            </w:r>
+          </w:p>
+        </w:tc>
+        <w:tc>
+          <w:tcPr>
+            <w:tcW w:type="dxa" w:w="1377"/>
+          </w:tcPr>
+          <w:p>
+            <w:r/>
+            <w:r>
+              <w:rPr>
+                <w:sz w:val="18"/>
+              </w:rPr>
+              <w:t>Chọn trường lọc: Kỹ năng / Vị trí (FR-006) / Ngày tạo (FR-007)</w:t>
+            </w:r>
+          </w:p>
+        </w:tc>
+      </w:tr>
+      <w:tr>
+        <w:tc>
+          <w:tcPr>
+            <w:tcW w:type="dxa" w:w="1377"/>
+          </w:tcPr>
+          <w:p>
+            <w:r/>
+            <w:r>
+              <w:rPr>
+                <w:sz w:val="18"/>
+              </w:rPr>
+              <w:t>03US-02</w:t>
+            </w:r>
+          </w:p>
+        </w:tc>
+        <w:tc>
+          <w:tcPr>
+            <w:tcW w:type="dxa" w:w="1377"/>
+          </w:tcPr>
+          <w:p>
+            <w:r/>
+            <w:r>
+              <w:rPr>
+                <w:sz w:val="18"/>
+              </w:rPr>
+              <w:t>Bộ lọc đa tiêu chí</w:t>
+            </w:r>
+          </w:p>
+        </w:tc>
+        <w:tc>
+          <w:tcPr>
+            <w:tcW w:type="dxa" w:w="1377"/>
+          </w:tcPr>
+          <w:p>
+            <w:r/>
+            <w:r>
+              <w:rPr>
+                <w:sz w:val="18"/>
+              </w:rPr>
+              <w:t>MULTI-SELECT</w:t>
+            </w:r>
+          </w:p>
+        </w:tc>
+        <w:tc>
+          <w:tcPr>
+            <w:tcW w:type="dxa" w:w="1377"/>
+          </w:tcPr>
+          <w:p>
+            <w:r/>
+            <w:r>
+              <w:rPr>
+                <w:sz w:val="18"/>
+              </w:rPr>
+              <w:t>Không</w:t>
+            </w:r>
+          </w:p>
+        </w:tc>
+        <w:tc>
+          <w:tcPr>
+            <w:tcW w:type="dxa" w:w="1377"/>
+          </w:tcPr>
+          <w:p>
+            <w:r/>
+            <w:r>
+              <w:rPr>
+                <w:sz w:val="18"/>
+              </w:rPr>
+              <w:t>Có</w:t>
+            </w:r>
+          </w:p>
+        </w:tc>
+        <w:tc>
+          <w:tcPr>
+            <w:tcW w:type="dxa" w:w="1377"/>
+          </w:tcPr>
+          <w:p>
+            <w:r/>
+            <w:r>
+              <w:rPr>
+                <w:sz w:val="18"/>
+              </w:rPr>
+              <w:t>ARRAY</w:t>
+            </w:r>
+          </w:p>
+        </w:tc>
+        <w:tc>
+          <w:tcPr>
+            <w:tcW w:type="dxa" w:w="1377"/>
+          </w:tcPr>
+          <w:p>
+            <w:r/>
+            <w:r>
+              <w:rPr>
+                <w:sz w:val="18"/>
+              </w:rPr>
+              <w:t>Kết hợp nhiều tiêu chí, logic AND (TC-KEY-004)</w:t>
+            </w:r>
+          </w:p>
+        </w:tc>
+      </w:tr>
+      <w:tr>
+        <w:tc>
+          <w:tcPr>
+            <w:tcW w:type="dxa" w:w="1377"/>
+          </w:tcPr>
+          <w:p>
+            <w:r/>
+            <w:r>
+              <w:rPr>
+                <w:sz w:val="18"/>
+              </w:rPr>
+              <w:t>03US-03</w:t>
+            </w:r>
+          </w:p>
+        </w:tc>
+        <w:tc>
+          <w:tcPr>
+            <w:tcW w:type="dxa" w:w="1377"/>
+          </w:tcPr>
+          <w:p>
+            <w:r/>
+            <w:r>
+              <w:rPr>
+                <w:sz w:val="18"/>
+              </w:rPr>
+              <w:t>Kết quả (Result list)</w:t>
+            </w:r>
+          </w:p>
+        </w:tc>
+        <w:tc>
+          <w:tcPr>
+            <w:tcW w:type="dxa" w:w="1377"/>
+          </w:tcPr>
+          <w:p>
+            <w:r/>
+            <w:r>
+              <w:rPr>
+                <w:sz w:val="18"/>
+              </w:rPr>
+              <w:t>TABLE/LIST (output)</w:t>
+            </w:r>
+          </w:p>
+        </w:tc>
+        <w:tc>
+          <w:tcPr>
+            <w:tcW w:type="dxa" w:w="1377"/>
+          </w:tcPr>
+          <w:p>
+            <w:r/>
+            <w:r>
+              <w:rPr>
+                <w:sz w:val="18"/>
+              </w:rPr>
+              <w:t>—</w:t>
+            </w:r>
+          </w:p>
+        </w:tc>
+        <w:tc>
+          <w:tcPr>
+            <w:tcW w:type="dxa" w:w="1377"/>
+          </w:tcPr>
+          <w:p>
+            <w:r/>
+            <w:r>
+              <w:rPr>
+                <w:sz w:val="18"/>
+              </w:rPr>
+              <w:t>Không</w:t>
+            </w:r>
+          </w:p>
+        </w:tc>
+        <w:tc>
+          <w:tcPr>
+            <w:tcW w:type="dxa" w:w="1377"/>
+          </w:tcPr>
+          <w:p>
+            <w:r/>
+            <w:r>
+              <w:rPr>
+                <w:sz w:val="18"/>
+              </w:rPr>
+              <w:t>—</w:t>
+            </w:r>
+          </w:p>
+        </w:tc>
+        <w:tc>
+          <w:tcPr>
+            <w:tcW w:type="dxa" w:w="1377"/>
+          </w:tcPr>
+          <w:p>
+            <w:r/>
+            <w:r>
+              <w:rPr>
+                <w:sz w:val="18"/>
+              </w:rPr>
+              <w:t>Trả danh sách khớp &lt; 3s (NFR-001); rỗng → 'Không tìm thấy ứng viên phù hợp với từ khóa' (AC2.3)</w:t>
+            </w:r>
+          </w:p>
+        </w:tc>
+      </w:tr>
+    </w:tbl>
+    <w:p>
+      <w:pPr>
+        <w:pStyle w:val="Heading2"/>
+      </w:pPr>
+      <w:r>
+        <w:rPr>
           <w:color w:val="1F4E79"/>
         </w:rPr>
-        <w:t>3. Bảng mã lỗi (Error Codes)</w:t>
+        <w:t>5. Bảng mã lỗi (Error Codes)</w:t>
       </w:r>
     </w:p>
     <w:tbl>
@@ -7402,9 +8488,28 @@
       <w:r>
         <w:rPr>
           <w:b/>
-          <w:i w:val="0"/>
         </w:rPr>
-        <w:t>🔗 Link prototype Figma: [[CHƯA CÓ LINK — cần dựng &amp; dán vào]]</w:t>
+        <w:t xml:space="preserve">🔗 Wireframe (Canva — view-only): </w:t>
+      </w:r>
+      <w:hyperlink r:id="rId9">
+        <w:r>
+          <w:rPr>
+            <w:color w:val="1155CC"/>
+            <w:u w:val="single"/>
+          </w:rPr>
+          <w:t>Canva — GenG ATS Wireframe</w:t>
+        </w:r>
+      </w:hyperlink>
+    </w:p>
+    <w:p>
+      <w:r>
+        <w:rPr>
+          <w:b/>
+        </w:rPr>
+        <w:t xml:space="preserve">🔗 Prototype (Figma) — “GenG ATS — Applicant Tracking System”: </w:t>
+      </w:r>
+      <w:r>
+        <w:t>Coming soon (Dec 2026) — interactive prototype đang dựng từ Mockup_Spec_GenG.md.</w:t>
       </w:r>
     </w:p>
     <w:p>

</xml_diff>

<commit_message>
FRS v1.2: confirm Vacancy-at-upload & bulk upload in scope (remove TBD markers)
</commit_message>
<xml_diff>
--- a/docs/geng-ats/GenG_FRS_v1.2.docx
+++ b/docs/geng-ats/GenG_FRS_v1.2.docx
@@ -4100,7 +4100,7 @@
               <w:rPr>
                 <w:sz w:val="18"/>
               </w:rPr>
-              <w:t>[[XÁC NHẬN]] gắn vị trí cho hồ sơ khi tải lên (liên kết FR-006)</w:t>
+              <w:t>Gắn vị trí cho hồ sơ khi tải lên (liên kết FR-006)</w:t>
             </w:r>
           </w:p>
         </w:tc>
@@ -4200,7 +4200,7 @@
               <w:rPr>
                 <w:sz w:val="18"/>
               </w:rPr>
-              <w:t>[[CHỐT YÊU CẦU — TC-UP-005]]: bật để nạp nhiều tệp vào hàng đợi xử lý</w:t>
+              <w:t>Cho phép nạp nhiều tệp hợp lệ vào hàng đợi xử lý (TC-UP-005)</w:t>
             </w:r>
           </w:p>
         </w:tc>
@@ -9834,7 +9834,7 @@
                 <w:b w:val="0"/>
                 <w:sz w:val="16"/>
               </w:rPr>
-              <w:t>[[CHỐT YÊU CẦU]] Nếu hỗ trợ: tất cả vào queue; nếu không: chỉ nhận 1</w:t>
+              <w:t>Tất cả tệp hợp lệ được nạp vào hàng đợi xử lý</w:t>
             </w:r>
           </w:p>
         </w:tc>

</xml_diff>